<commit_message>
docs: sync Slice 2 approved baseline
</commit_message>
<xml_diff>
--- a/docs/reference/02-Business-Rules.md.docx
+++ b/docs/reference/02-Business-Rules.md.docx
@@ -4662,6 +4662,287 @@
           <w:rtl w:val="0"/>
         </w:rPr>
         <w:t xml:space="preserve">Database Design 的 04-Database-Design.md 後續應依本文件同步調整付款、退款、媒合與取消相關 schema，避免保留舊版 HOLD/PENDING_PAYMENT 假設。</w:t>
+      </w:r>
+    </w:p>
+    <w:p>
+      <w:pPr>
+        <w:rPr/>
+      </w:pPr>
+      <w:r>
+        <w:rPr>
+          <w:rtl w:val="0"/>
+        </w:rPr>
+      </w:r>
+    </w:p>
+    <w:p>
+      <w:pPr>
+        <w:rPr/>
+      </w:pPr>
+      <w:r>
+        <w:rPr>
+          <w:rtl w:val="0"/>
+        </w:rPr>
+        <w:t xml:space="preserve">7. Slice 2 Baseline Backfill Addendum</w:t>
+      </w:r>
+    </w:p>
+    <w:p>
+      <w:pPr>
+        <w:rPr/>
+      </w:pPr>
+      <w:r>
+        <w:rPr>
+          <w:rFonts w:ascii="Arial Unicode MS" w:cs="Arial Unicode MS" w:eastAsia="Arial Unicode MS" w:hAnsi="Arial Unicode MS"/>
+          <w:rtl w:val="0"/>
+        </w:rPr>
+        <w:t xml:space="preserve">本附錄為 Slice 2「Coach Supply + Lesson Demand」之核准補充基線。若本文件前述章節、舊 API 範例或舊用語與本附錄衝突，以本附錄為準；未被本附錄變更的 Business Rules 維持有效。</w:t>
+      </w:r>
+    </w:p>
+    <w:p>
+      <w:pPr>
+        <w:rPr/>
+      </w:pPr>
+      <w:r>
+        <w:rPr>
+          <w:rtl w:val="0"/>
+        </w:rPr>
+      </w:r>
+    </w:p>
+    <w:p>
+      <w:pPr>
+        <w:rPr/>
+      </w:pPr>
+      <w:r>
+        <w:rPr>
+          <w:rFonts w:ascii="Arial Unicode MS" w:cs="Arial Unicode MS" w:eastAsia="Arial Unicode MS" w:hAnsi="Arial Unicode MS"/>
+          <w:rtl w:val="0"/>
+        </w:rPr>
+        <w:t xml:space="preserve">7.1 Coach Onboarding 與角色生命週期</w:t>
+      </w:r>
+    </w:p>
+    <w:p>
+      <w:pPr>
+        <w:rPr/>
+      </w:pPr>
+      <w:r>
+        <w:rPr>
+          <w:rFonts w:ascii="Arial Unicode MS" w:cs="Arial Unicode MS" w:eastAsia="Arial Unicode MS" w:hAnsi="Arial Unicode MS"/>
+          <w:rtl w:val="0"/>
+        </w:rPr>
+        <w:t xml:space="preserve">BR-S2-COACH-001｜同 organization 的 ACTIVE authenticated User 可提出 Coach Application，不要求申請前已具有 COACH role。首次 LINE 登入仍只依既有 Identity 規則取得一般會員身分，不自動授予 COACH。</w:t>
+      </w:r>
+    </w:p>
+    <w:p>
+      <w:pPr>
+        <w:rPr/>
+      </w:pPr>
+      <w:r>
+        <w:rPr>
+          <w:rFonts w:ascii="Arial Unicode MS" w:cs="Arial Unicode MS" w:eastAsia="Arial Unicode MS" w:hAnsi="Arial Unicode MS"/>
+          <w:rtl w:val="0"/>
+        </w:rPr>
+        <w:t xml:space="preserve">BR-S2-COACH-002｜Committee 核准 Coach Application 時，必須在同一 transaction 完成 CoachApplication=APPROVED、CoachProfile=APPROVED、同 organization 的 ACTIVE COACH RoleAssignment，以及必要 Audit；需要通知時同 transaction 寫入 Outbox。任一步驟失敗則全部 rollback。</w:t>
+      </w:r>
+    </w:p>
+    <w:p>
+      <w:pPr>
+        <w:rPr/>
+      </w:pPr>
+      <w:r>
+        <w:rPr>
+          <w:rFonts w:ascii="Arial Unicode MS" w:cs="Arial Unicode MS" w:eastAsia="Arial Unicode MS" w:hAnsi="Arial Unicode MS"/>
+          <w:rtl w:val="0"/>
+        </w:rPr>
+        <w:t xml:space="preserve">BR-S2-COACH-003｜Coach Application 被拒絕時不得授予 COACH role。</w:t>
+      </w:r>
+    </w:p>
+    <w:p>
+      <w:pPr>
+        <w:rPr/>
+      </w:pPr>
+      <w:r>
+        <w:rPr>
+          <w:rFonts w:ascii="Arial Unicode MS" w:cs="Arial Unicode MS" w:eastAsia="Arial Unicode MS" w:hAnsi="Arial Unicode MS"/>
+          <w:rtl w:val="0"/>
+        </w:rPr>
+        <w:t xml:space="preserve">BR-S2-COACH-004｜建立或提交 Coach Availability 必須同時符合：User 為 ACTIVE、同 organization 具 ACTIVE COACH role、CoachProfile=APPROVED，且 resource organization scope 一致。只有角色或只有已核准 Profile 均不足以建立 Availability。</w:t>
+      </w:r>
+    </w:p>
+    <w:p>
+      <w:pPr>
+        <w:rPr/>
+      </w:pPr>
+      <w:r>
+        <w:rPr>
+          <w:rtl w:val="0"/>
+        </w:rPr>
+      </w:r>
+    </w:p>
+    <w:p>
+      <w:pPr>
+        <w:rPr/>
+      </w:pPr>
+      <w:r>
+        <w:rPr>
+          <w:rtl w:val="0"/>
+        </w:rPr>
+        <w:t xml:space="preserve">7.2 Availability Proposal Canonical Rule</w:t>
+      </w:r>
+    </w:p>
+    <w:p>
+      <w:pPr>
+        <w:rPr/>
+      </w:pPr>
+      <w:r>
+        <w:rPr>
+          <w:rFonts w:ascii="Arial Unicode MS" w:cs="Arial Unicode MS" w:eastAsia="Arial Unicode MS" w:hAnsi="Arial Unicode MS"/>
+          <w:rtl w:val="0"/>
+        </w:rPr>
+        <w:t xml:space="preserve">BR-S2-AVAIL-001｜一筆 Coach Availability Proposal 只代表一個 [startAt, endAt) 時段。教練欲提供多個不同時段時，應建立多筆 Proposal；不得把多個 windows 封裝成同一 Proposal Aggregate。</w:t>
+      </w:r>
+    </w:p>
+    <w:p>
+      <w:pPr>
+        <w:rPr/>
+      </w:pPr>
+      <w:r>
+        <w:rPr>
+          <w:rFonts w:ascii="Arial Unicode MS" w:cs="Arial Unicode MS" w:eastAsia="Arial Unicode MS" w:hAnsi="Arial Unicode MS"/>
+          <w:rtl w:val="0"/>
+        </w:rPr>
+        <w:t xml:space="preserve">BR-S2-AVAIL-002｜Proposal 的時間仍須嚴格位於未來，startAt &lt; endAt；審核、Claim 與後續狀態均以單一 Proposal 為單位。</w:t>
+      </w:r>
+    </w:p>
+    <w:p>
+      <w:pPr>
+        <w:rPr/>
+      </w:pPr>
+      <w:r>
+        <w:rPr>
+          <w:rtl w:val="0"/>
+        </w:rPr>
+      </w:r>
+    </w:p>
+    <w:p>
+      <w:pPr>
+        <w:rPr/>
+      </w:pPr>
+      <w:r>
+        <w:rPr>
+          <w:rtl w:val="0"/>
+        </w:rPr>
+        <w:t xml:space="preserve">7.3 Lesson Request Canonical Rule</w:t>
+      </w:r>
+    </w:p>
+    <w:p>
+      <w:pPr>
+        <w:rPr/>
+      </w:pPr>
+      <w:r>
+        <w:rPr>
+          <w:rFonts w:ascii="Arial Unicode MS" w:cs="Arial Unicode MS" w:eastAsia="Arial Unicode MS" w:hAnsi="Arial Unicode MS"/>
+          <w:rtl w:val="0"/>
+        </w:rPr>
+        <w:t xml:space="preserve">BR-S2-LESSON-001｜Lesson Request 最多指定一位 preferred CoachProfile，也可不指定；不得在單一 Lesson Request 使用 preferredCoachIds 多選語意。</w:t>
+      </w:r>
+    </w:p>
+    <w:p>
+      <w:pPr>
+        <w:rPr/>
+      </w:pPr>
+      <w:r>
+        <w:rPr>
+          <w:rFonts w:ascii="Arial Unicode MS" w:cs="Arial Unicode MS" w:eastAsia="Arial Unicode MS" w:hAnsi="Arial Unicode MS"/>
+          <w:rtl w:val="0"/>
+        </w:rPr>
+        <w:t xml:space="preserve">BR-S2-LESSON-002｜一般學員自行建立 Lesson Request 時，requesterUserId 必須由 Backend authenticated principal 決定，前端不得指定其他 User 作為 requester。Committee 代建屬獨立授權情境，必須保留實際 actor 與 Audit，不得偽裝為學員自行建立。</w:t>
+      </w:r>
+    </w:p>
+    <w:p>
+      <w:pPr>
+        <w:rPr/>
+      </w:pPr>
+      <w:r>
+        <w:rPr>
+          <w:rFonts w:ascii="Arial Unicode MS" w:cs="Arial Unicode MS" w:eastAsia="Arial Unicode MS" w:hAnsi="Arial Unicode MS"/>
+          <w:rtl w:val="0"/>
+        </w:rPr>
+        <w:t xml:space="preserve">BR-S2-LESSON-003｜學員若從已核准公開 Availability 發起需求，可引用單一 selectedAvailabilityProposalId；Claim 仍在正式 submission transaction 建立，且不改變「一 Proposal 一時段」與「最多一位 preferred coach」規則。</w:t>
+      </w:r>
+    </w:p>
+    <w:p>
+      <w:pPr>
+        <w:rPr/>
+      </w:pPr>
+      <w:r>
+        <w:rPr>
+          <w:rtl w:val="0"/>
+        </w:rPr>
+      </w:r>
+    </w:p>
+    <w:p>
+      <w:pPr>
+        <w:rPr/>
+      </w:pPr>
+      <w:r>
+        <w:rPr>
+          <w:rtl w:val="0"/>
+        </w:rPr>
+        <w:t xml:space="preserve">7.4 Slice Boundary / Deferred FK</w:t>
+      </w:r>
+    </w:p>
+    <w:p>
+      <w:pPr>
+        <w:rPr/>
+      </w:pPr>
+      <w:r>
+        <w:rPr>
+          <w:rFonts w:ascii="Arial Unicode MS" w:cs="Arial Unicode MS" w:eastAsia="Arial Unicode MS" w:hAnsi="Arial Unicode MS"/>
+          <w:rtl w:val="0"/>
+        </w:rPr>
+        <w:t xml:space="preserve">BR-S2-BOUNDARY-001｜Slice 2 可保存 coach_availability_claims.converted_course_match_id 的 nullable identifier，但 Course Match 屬 Slice 3；Slice 2 不得為滿足 FK 而提前建立 course_matches，也不得把 Matching 邏輯偷跑進 Slice 2。正式 FK 由 Slice 3 以新的 forward migration 補上。</w:t>
+      </w:r>
+    </w:p>
+    <w:p>
+      <w:pPr>
+        <w:rPr/>
+      </w:pPr>
+      <w:r>
+        <w:rPr>
+          <w:rtl w:val="0"/>
+        </w:rPr>
+      </w:r>
+    </w:p>
+    <w:p>
+      <w:pPr>
+        <w:rPr/>
+      </w:pPr>
+      <w:r>
+        <w:rPr>
+          <w:rtl w:val="0"/>
+        </w:rPr>
+        <w:t xml:space="preserve">7.5 Backfill Review Result</w:t>
+      </w:r>
+    </w:p>
+    <w:p>
+      <w:pPr>
+        <w:rPr/>
+      </w:pPr>
+      <w:r>
+        <w:rPr>
+          <w:rFonts w:ascii="Arial Unicode MS" w:cs="Arial Unicode MS" w:eastAsia="Arial Unicode MS" w:hAnsi="Arial Unicode MS"/>
+          <w:rtl w:val="0"/>
+        </w:rPr>
+        <w:t xml:space="preserve">上述四項為 Slice 2 Approved Baseline。Database、Domain、API、UI/UX、Test 與 Development 文件須依相同語意對齊後才開始 Slice 2 Coding。</w:t>
+      </w:r>
+    </w:p>
+    <w:p>
+      <w:pPr>
+        <w:rPr/>
+      </w:pPr>
+      <w:r>
+        <w:rPr>
+          <w:rtl w:val="0"/>
+        </w:rPr>
       </w:r>
     </w:p>
     <w:p>

</xml_diff>